<commit_message>
update WIS2 Manual build
</commit_message>
<xml_diff>
--- a/manual/wis2-manual-APPROVED.docx
+++ b/manual/wis2-manual-APPROVED.docx
@@ -93,7 +93,7 @@
         <w:pStyle w:val="Date"/>
       </w:pPr>
       <w:r>
-        <w:t xml:space="preserve">2026-01-20</w:t>
+        <w:t xml:space="preserve">2026-03-13</w:t>
       </w:r>
     </w:p>
     <w:p>
@@ -146,7 +146,7 @@
               <w:jc w:val="left"/>
             </w:pPr>
             <w:r>
-              <w:t xml:space="preserve">Date: 2026-01-20</w:t>
+              <w:t xml:space="preserve">Date: 2026-03-13</w:t>
             </w:r>
           </w:p>
         </w:tc>
@@ -6202,7 +6202,7 @@
       </w:r>
     </w:p>
     <w:bookmarkEnd w:id="45"/>
-    <w:bookmarkStart w:id="51" w:name="X872e5adb486bf276b54df5a5b8982c75de20588"/>
+    <w:bookmarkStart w:id="58" w:name="X872e5adb486bf276b54df5a5b8982c75de20588"/>
     <w:p>
       <w:pPr>
         <w:pStyle w:val="Heading1"/>
@@ -6224,29 +6224,13 @@
         <w:pStyle w:val="BodyText"/>
       </w:pPr>
       <w:r>
-        <w:t xml:space="preserve">"present new operating concepts that will improve operational efficiency, information sharing and service delivery, and enable users to [more effectively] exploit data".foot[.small]</w:t>
-      </w:r>
-      <w:r>
-        <w:t xml:space="preserve"> </w:t>
-      </w:r>
-      <w:r>
-        <w:t xml:space="preserve">Note:[</w:t>
-      </w:r>
-      <w:hyperlink r:id="rId46">
-        <w:r>
-          <w:rPr>
-            <w:rStyle w:val="Hyperlink"/>
-            <w:iCs/>
-            <w:i/>
-          </w:rPr>
-          <w:t xml:space="preserve">WMO Guidelines on Emerging Data Issues</w:t>
-        </w:r>
-      </w:hyperlink>
-      <w:r>
-        <w:t xml:space="preserve"> </w:t>
-      </w:r>
-      <w:r>
-        <w:t xml:space="preserve">(WMO‑No. 1239)]</w:t>
+        <w:t xml:space="preserve">"present new operating concepts that will improve operational efficiency, information sharing and service delivery, and enable users to [more effectively] exploit data".</w:t>
+      </w:r>
+      <w:r>
+        <w:rPr>
+          <w:rStyle w:val="FootnoteReference"/>
+        </w:rPr>
+        <w:footnoteReference w:id="46"/>
       </w:r>
     </w:p>
     <w:p>
@@ -6262,40 +6246,13 @@
         <w:pStyle w:val="BodyText"/>
       </w:pPr>
       <w:r>
-        <w:t xml:space="preserve">"The Web is the World’s most successful vendor neutral distributed information system, enabling people to access applications and services right across the World from their smart phones, tablets, laptops and other computing devices. […] The Web of data […​] ranges from small amounts of data to vast datasets,[…​][which are either] open to all or restricted to a few. Data can be consumed by Web pages, downloaded for local processing, or accessed via network APIs that support remote processing."foot[.small]</w:t>
-      </w:r>
-      <w:r>
-        <w:t xml:space="preserve"> </w:t>
-      </w:r>
-      <w:r>
-        <w:t xml:space="preserve">Note:[See Raggett, D.</w:t>
-      </w:r>
-      <w:r>
-        <w:t xml:space="preserve"> </w:t>
-      </w:r>
-      <w:r>
-        <w:rPr>
-          <w:iCs/>
-          <w:i/>
-        </w:rPr>
-        <w:t xml:space="preserve">W3C Study of Practices and Tooling for Web Data Standardisation</w:t>
-      </w:r>
-      <w:r>
-        <w:t xml:space="preserve">; World Wide Web Consortium (W3C), 2017.</w:t>
-      </w:r>
-      <w:r>
-        <w:t xml:space="preserve"> </w:t>
-      </w:r>
-      <w:hyperlink r:id="rId47">
-        <w:r>
-          <w:rPr>
-            <w:rStyle w:val="Hyperlink"/>
-          </w:rPr>
-          <w:t xml:space="preserve">https://www.w3.org/2017/12/odi-study/#introduction</w:t>
-        </w:r>
-      </w:hyperlink>
-      <w:r>
-        <w:t xml:space="preserve">.]</w:t>
+        <w:t xml:space="preserve">"The Web is the World’s most successful vendor neutral distributed information system, enabling people to access applications and services right across the World from their smart phones, tablets, laptops and other computing devices. […] The Web of data […​] ranges from small amounts of data to vast datasets,[…​][which are either] open to all or restricted to a few. Data can be consumed by Web pages, downloaded for local processing, or accessed via network APIs that support remote processing".</w:t>
+      </w:r>
+      <w:r>
+        <w:rPr>
+          <w:rStyle w:val="FootnoteReference"/>
+        </w:rPr>
+        <w:footnoteReference w:id="48"/>
       </w:r>
     </w:p>
     <w:p>
@@ -6361,13 +6318,13 @@
         <w:t xml:space="preserve"> </w:t>
       </w:r>
       <w:r>
-        <w:t xml:space="preserve">WIS 2.0 adopts web technologies and leverages industry best practices and open standards.foot[.small]</w:t>
-      </w:r>
-      <w:r>
-        <w:t xml:space="preserve"> </w:t>
-      </w:r>
-      <w:r>
-        <w:t xml:space="preserve">Note:[Particularly open standards from the Internet Engineering Task Force (IETF), W3C, the Open Geospatial Consortium (OGC).]</w:t>
+        <w:t xml:space="preserve">WIS 2.0 adopts web technologies and leverages industry best practices and open standards.</w:t>
+      </w:r>
+      <w:r>
+        <w:rPr>
+          <w:rStyle w:val="FootnoteReference"/>
+        </w:rPr>
+        <w:footnoteReference w:id="50"/>
       </w:r>
     </w:p>
     <w:p>
@@ -6412,40 +6369,13 @@
         <w:t xml:space="preserve"> </w:t>
       </w:r>
       <w:r>
-        <w:t xml:space="preserve">WIS 2.0 uses URLs to identify resources (i.e., web pages, data, metadata, APIs).foot[.small]</w:t>
-      </w:r>
-      <w:r>
-        <w:t xml:space="preserve"> </w:t>
-      </w:r>
-      <w:r>
-        <w:t xml:space="preserve">Note:[For more information on identifying resources, refer to W3C Technical Architecture Group.</w:t>
-      </w:r>
-      <w:r>
-        <w:t xml:space="preserve"> </w:t>
-      </w:r>
-      <w:r>
-        <w:rPr>
-          <w:iCs/>
-          <w:i/>
-        </w:rPr>
-        <w:t xml:space="preserve">Architecture of the World Wide Web Volume One, 2. Identification</w:t>
-      </w:r>
-      <w:r>
-        <w:t xml:space="preserve">; World Wide Web Consortium (W3C), 2004.</w:t>
-      </w:r>
-      <w:r>
-        <w:t xml:space="preserve"> </w:t>
-      </w:r>
-      <w:hyperlink r:id="rId48">
-        <w:r>
-          <w:rPr>
-            <w:rStyle w:val="Hyperlink"/>
-          </w:rPr>
-          <w:t xml:space="preserve">https://www.w3.org/TR/webarch/#identification</w:t>
-        </w:r>
-      </w:hyperlink>
-      <w:r>
-        <w:t xml:space="preserve">.]</w:t>
+        <w:t xml:space="preserve">WIS 2.0 uses URLs to identify resources (i.e., web pages, data, metadata, APIs).</w:t>
+      </w:r>
+      <w:r>
+        <w:rPr>
+          <w:rStyle w:val="FootnoteReference"/>
+        </w:rPr>
+        <w:footnoteReference w:id="51"/>
       </w:r>
     </w:p>
     <w:p>
@@ -6528,13 +6458,19 @@
         <w:pStyle w:val="BodyText"/>
       </w:pPr>
       <w:r>
-        <w:t xml:space="preserve">The first generation of WIS was primarily concerned with datafoot[.small]</w:t>
-      </w:r>
-      <w:r>
-        <w:t xml:space="preserve"> </w:t>
-      </w:r>
-      <w:r>
-        <w:t xml:space="preserve">Note:[The term ‘data’ is used loosely here to cover everything from products to information to data.] as traditionally exchanged via the GTS. A major issue with this data-centric approach is that often it is unclear to users how they might access (download or otherwise interact with) data that are of interest to them. In line with industry practice, WIS 2.0 recognizes that users, whether humans or software systems, will always interact with data published using WIS through some form of web service. Web services are used for a broad range of functions – to download data for local use, to request routine delivery of data, to view or display data, and so forth.</w:t>
+        <w:t xml:space="preserve">The first generation of WIS was primarily concerned with data</w:t>
+      </w:r>
+      <w:r>
+        <w:rPr>
+          <w:rStyle w:val="FootnoteReference"/>
+        </w:rPr>
+        <w:footnoteReference w:id="53"/>
+      </w:r>
+      <w:r>
+        <w:t xml:space="preserve"> </w:t>
+      </w:r>
+      <w:r>
+        <w:t xml:space="preserve">as traditionally exchanged via the GTS. A major issue with this data-centric approach is that often it is unclear to users how they might access (download or otherwise interact with) data that are of interest to them. In line with industry practice, WIS 2.0 recognizes that users, whether humans or software systems, will always interact with data published using WIS through some form of web service. Web services are used for a broad range of functions – to download data for local use, to request routine delivery of data, to view or display data, and so forth.</w:t>
       </w:r>
     </w:p>
     <w:p>
@@ -6643,13 +6579,13 @@
         </w:numPr>
       </w:pPr>
       <w:r>
-        <w:t xml:space="preserve">Using ‘data reduction’ web services to process high-volume, complex data remotely, Members’ agencies and institutions can deliver high-value, high-quality services to their governments and citizens, helping them to meet their national mandates more effectively and without the need to invest in and operate their own data management infrastructure.foot[.small]</w:t>
-      </w:r>
-      <w:r>
-        <w:t xml:space="preserve"> </w:t>
-      </w:r>
-      <w:r>
-        <w:t xml:space="preserve">Note:[The provision of data processing services in this way supports the WMO principles that no Member should be left behind and that no Member stands alone – through cooperation, all Members should have access to the necessary capability to work with the predicted increase in data volumes.]</w:t>
+        <w:t xml:space="preserve">Using ‘data reduction’ web services to process high-volume, complex data remotely, Members’ agencies and institutions can deliver high-value, high-quality services to their governments and citizens, helping them to meet their national mandates more effectively and without the need to invest in and operate their own data management infrastructure.</w:t>
+      </w:r>
+      <w:r>
+        <w:rPr>
+          <w:rStyle w:val="FootnoteReference"/>
+        </w:rPr>
+        <w:footnoteReference w:id="54"/>
       </w:r>
     </w:p>
     <w:p>
@@ -6657,18 +6593,12 @@
         <w:pStyle w:val="FirstParagraph"/>
       </w:pPr>
       <w:r>
-        <w:t xml:space="preserve">Real-time delivery of data and products in support of the World Weather Watch programme remains a core requirement for WIS. Data exchange methods permitted on the GTSfoot[.small]</w:t>
-      </w:r>
-      <w:r>
-        <w:t xml:space="preserve"> </w:t>
-      </w:r>
-      <w:r>
-        <w:t xml:space="preserve">Note:[File Transfer Protocol (FTP) and Secure File Transfer Protocol (SFTP); see the</w:t>
-      </w:r>
-      <w:r>
-        <w:t xml:space="preserve"> </w:t>
-      </w:r>
-      <w:hyperlink r:id="rId49">
+        <w:t xml:space="preserve">Real-time delivery of data and products in support of the World Weather Watch programme remains a core requirement for WIS. Data exchange methods permitted on the GTSfoot:[[File Transfer Protocol (FTP) and Secure File Transfer Protocol (SFTP); see the</w:t>
+      </w:r>
+      <w:r>
+        <w:t xml:space="preserve"> </w:t>
+      </w:r>
+      <w:hyperlink r:id="rId55">
         <w:r>
           <w:rPr>
             <w:rStyle w:val="Hyperlink"/>
@@ -6986,66 +6916,19 @@
         </w:numPr>
       </w:pPr>
       <w:r>
-        <w:t xml:space="preserve">Indexing by commercial search engines will help users discover data and associated services using their preferred search enginefoot[.small]</w:t>
-      </w:r>
-      <w:r>
-        <w:t xml:space="preserve"> </w:t>
-      </w:r>
-      <w:r>
-        <w:t xml:space="preserve">Note:[As an example of how Google uses schema.org structured markup to enable users to find datasets, see Castelvecchi, D. Google Unveils Search Engine for Open Data.</w:t>
-      </w:r>
-      <w:r>
-        <w:t xml:space="preserve"> </w:t>
-      </w:r>
-      <w:r>
-        <w:rPr>
-          <w:iCs/>
-          <w:i/>
-        </w:rPr>
-        <w:t xml:space="preserve">Nature</w:t>
-      </w:r>
-      <w:r>
-        <w:t xml:space="preserve"> </w:t>
-      </w:r>
-      <w:r>
-        <w:rPr>
-          <w:bCs/>
-          <w:b/>
-        </w:rPr>
-        <w:t xml:space="preserve">2018</w:t>
-      </w:r>
-      <w:r>
-        <w:t xml:space="preserve">,</w:t>
-      </w:r>
-      <w:r>
-        <w:t xml:space="preserve"> </w:t>
-      </w:r>
-      <w:r>
-        <w:rPr>
-          <w:iCs/>
-          <w:i/>
-        </w:rPr>
-        <w:t xml:space="preserve">561</w:t>
-      </w:r>
-      <w:r>
-        <w:t xml:space="preserve"> </w:t>
-      </w:r>
-      <w:r>
-        <w:t xml:space="preserve">(7722), 161–162.</w:t>
-      </w:r>
-      <w:r>
-        <w:t xml:space="preserve"> </w:t>
-      </w:r>
-      <w:hyperlink r:id="rId50">
-        <w:r>
-          <w:rPr>
-            <w:rStyle w:val="Hyperlink"/>
-          </w:rPr>
-          <w:t xml:space="preserve">https://doi.org/10.1038/d41586-018-06201-x</w:t>
-        </w:r>
-      </w:hyperlink>
-      <w:r>
-        <w:t xml:space="preserve">.] rather than having to find and use a WIS portal.</w:t>
+        <w:t xml:space="preserve">Indexing by commercial search engines will help users discover data and associated services using their preferred search engine</w:t>
+      </w:r>
+      <w:r>
+        <w:rPr>
+          <w:rStyle w:val="FootnoteReference"/>
+        </w:rPr>
+        <w:footnoteReference w:id="56"/>
+      </w:r>
+      <w:r>
+        <w:t xml:space="preserve"> </w:t>
+      </w:r>
+      <w:r>
+        <w:t xml:space="preserve">rather than having to find and use a WIS portal.</w:t>
       </w:r>
     </w:p>
     <w:p>
@@ -7056,8 +6939,8 @@
         <w:t xml:space="preserve">Note: The Global Discovery Catalogue will provide the necessary functionality to support indexing WIS discovery metadata by commercial search engines.</w:t>
       </w:r>
     </w:p>
-    <w:bookmarkEnd w:id="51"/>
-    <w:bookmarkStart w:id="52" w:name="Xfe2bcf7c7e055f95c993f13474ddddd30105c8a"/>
+    <w:bookmarkEnd w:id="58"/>
+    <w:bookmarkStart w:id="59" w:name="Xfe2bcf7c7e055f95c993f13474ddddd30105c8a"/>
     <w:p>
       <w:pPr>
         <w:pStyle w:val="Heading1"/>
@@ -8436,8 +8319,8 @@
         <w:t xml:space="preserve">Written English.</w:t>
       </w:r>
     </w:p>
-    <w:bookmarkEnd w:id="52"/>
-    <w:bookmarkStart w:id="53" w:name="X7416b81f2c4fb1d2adf5e1dc166d978b82b2b94"/>
+    <w:bookmarkEnd w:id="59"/>
+    <w:bookmarkStart w:id="60" w:name="X7416b81f2c4fb1d2adf5e1dc166d978b82b2b94"/>
     <w:p>
       <w:pPr>
         <w:pStyle w:val="Heading1"/>
@@ -8902,8 +8785,8 @@
         </w:tc>
       </w:tr>
     </w:tbl>
-    <w:bookmarkEnd w:id="53"/>
-    <w:bookmarkStart w:id="55" w:name="Xa09b69db996b5499d5e71083c5716f9e698590e"/>
+    <w:bookmarkEnd w:id="60"/>
+    <w:bookmarkStart w:id="62" w:name="Xa09b69db996b5499d5e71083c5716f9e698590e"/>
     <w:p>
       <w:pPr>
         <w:pStyle w:val="Heading1"/>
@@ -8916,7 +8799,7 @@
       <w:pPr>
         <w:pStyle w:val="FirstParagraph"/>
       </w:pPr>
-      <w:hyperlink r:id="rId54">
+      <w:hyperlink r:id="rId61">
         <w:r>
           <w:rPr>
             <w:rStyle w:val="Hyperlink"/>
@@ -8925,8 +8808,8 @@
         </w:r>
       </w:hyperlink>
     </w:p>
-    <w:bookmarkEnd w:id="55"/>
-    <w:bookmarkStart w:id="57" w:name="X9c1eca1101f79beb78a5fc2ab66aeeda1901d62"/>
+    <w:bookmarkEnd w:id="62"/>
+    <w:bookmarkStart w:id="64" w:name="X9c1eca1101f79beb78a5fc2ab66aeeda1901d62"/>
     <w:p>
       <w:pPr>
         <w:pStyle w:val="Heading1"/>
@@ -8939,7 +8822,7 @@
       <w:pPr>
         <w:pStyle w:val="FirstParagraph"/>
       </w:pPr>
-      <w:hyperlink r:id="rId56">
+      <w:hyperlink r:id="rId63">
         <w:r>
           <w:rPr>
             <w:rStyle w:val="Hyperlink"/>
@@ -8948,8 +8831,8 @@
         </w:r>
       </w:hyperlink>
     </w:p>
-    <w:bookmarkEnd w:id="57"/>
-    <w:bookmarkStart w:id="59" w:name="Xe4841322ad356bb289937d20d55a3fd74e1b3a5"/>
+    <w:bookmarkEnd w:id="64"/>
+    <w:bookmarkStart w:id="66" w:name="Xe4841322ad356bb289937d20d55a3fd74e1b3a5"/>
     <w:p>
       <w:pPr>
         <w:pStyle w:val="Heading1"/>
@@ -8962,7 +8845,7 @@
       <w:pPr>
         <w:pStyle w:val="FirstParagraph"/>
       </w:pPr>
-      <w:hyperlink r:id="rId58">
+      <w:hyperlink r:id="rId65">
         <w:r>
           <w:rPr>
             <w:rStyle w:val="Hyperlink"/>
@@ -8971,7 +8854,7 @@
         </w:r>
       </w:hyperlink>
     </w:p>
-    <w:bookmarkEnd w:id="59"/>
+    <w:bookmarkEnd w:id="66"/>
     <w:sectPr/>
   </w:body>
 </w:document>
@@ -9043,6 +8926,259 @@
           <w:t xml:space="preserve">https://community.wmo.int/governance/commission-membership/infcom</w:t>
         </w:r>
       </w:hyperlink>
+    </w:p>
+  </w:footnote>
+  <w:footnote w:id="46">
+    <w:p>
+      <w:pPr>
+        <w:pStyle w:val="FootnoteText"/>
+      </w:pPr>
+      <w:r>
+        <w:rPr>
+          <w:rStyle w:val="FootnoteReference"/>
+        </w:rPr>
+        <w:footnoteRef/>
+      </w:r>
+      <w:r>
+        <w:t xml:space="preserve"> </w:t>
+      </w:r>
+      <w:hyperlink r:id="rId47">
+        <w:r>
+          <w:rPr>
+            <w:rStyle w:val="Hyperlink"/>
+            <w:iCs/>
+            <w:i/>
+          </w:rPr>
+          <w:t xml:space="preserve">WMO Guidelines on Emerging Data Issues</w:t>
+        </w:r>
+      </w:hyperlink>
+      <w:r>
+        <w:t xml:space="preserve"> </w:t>
+      </w:r>
+      <w:r>
+        <w:t xml:space="preserve">(WMO‑No. 1239)</w:t>
+      </w:r>
+    </w:p>
+  </w:footnote>
+  <w:footnote w:id="48">
+    <w:p>
+      <w:pPr>
+        <w:pStyle w:val="FootnoteText"/>
+      </w:pPr>
+      <w:r>
+        <w:rPr>
+          <w:rStyle w:val="FootnoteReference"/>
+        </w:rPr>
+        <w:footnoteRef/>
+      </w:r>
+      <w:r>
+        <w:t xml:space="preserve"> </w:t>
+      </w:r>
+      <w:r>
+        <w:t xml:space="preserve">See Raggett, D.</w:t>
+      </w:r>
+      <w:r>
+        <w:t xml:space="preserve"> </w:t>
+      </w:r>
+      <w:r>
+        <w:rPr>
+          <w:iCs/>
+          <w:i/>
+        </w:rPr>
+        <w:t xml:space="preserve">W3C Study of Practices and Tooling for Web Data Standardisation</w:t>
+      </w:r>
+      <w:r>
+        <w:t xml:space="preserve">; World Wide Web Consortium (W3C), 2017.</w:t>
+      </w:r>
+      <w:r>
+        <w:t xml:space="preserve"> </w:t>
+      </w:r>
+      <w:hyperlink r:id="rId49">
+        <w:r>
+          <w:rPr>
+            <w:rStyle w:val="Hyperlink"/>
+          </w:rPr>
+          <w:t xml:space="preserve">https://www.w3.org/2017/12/odi-study/#introduction</w:t>
+        </w:r>
+      </w:hyperlink>
+      <w:r>
+        <w:t xml:space="preserve">.</w:t>
+      </w:r>
+    </w:p>
+  </w:footnote>
+  <w:footnote w:id="50">
+    <w:p>
+      <w:pPr>
+        <w:pStyle w:val="FootnoteText"/>
+      </w:pPr>
+      <w:r>
+        <w:rPr>
+          <w:rStyle w:val="FootnoteReference"/>
+        </w:rPr>
+        <w:footnoteRef/>
+      </w:r>
+      <w:r>
+        <w:t xml:space="preserve"> </w:t>
+      </w:r>
+      <w:r>
+        <w:t xml:space="preserve">Particularly open standards from the Internet Engineering Task Force (IETF), W3C, the Open Geospatial Consortium (OGC).</w:t>
+      </w:r>
+    </w:p>
+  </w:footnote>
+  <w:footnote w:id="51">
+    <w:p>
+      <w:pPr>
+        <w:pStyle w:val="FootnoteText"/>
+      </w:pPr>
+      <w:r>
+        <w:rPr>
+          <w:rStyle w:val="FootnoteReference"/>
+        </w:rPr>
+        <w:footnoteRef/>
+      </w:r>
+      <w:r>
+        <w:t xml:space="preserve"> </w:t>
+      </w:r>
+      <w:r>
+        <w:t xml:space="preserve">For more information on identifying resources, refer to W3C Technical Architecture Group.</w:t>
+      </w:r>
+      <w:r>
+        <w:t xml:space="preserve"> </w:t>
+      </w:r>
+      <w:r>
+        <w:rPr>
+          <w:iCs/>
+          <w:i/>
+        </w:rPr>
+        <w:t xml:space="preserve">Architecture of the World Wide Web Volume One, 2. Identification</w:t>
+      </w:r>
+      <w:r>
+        <w:t xml:space="preserve">; World Wide Web Consortium (W3C), 2004.</w:t>
+      </w:r>
+      <w:r>
+        <w:t xml:space="preserve"> </w:t>
+      </w:r>
+      <w:hyperlink r:id="rId52">
+        <w:r>
+          <w:rPr>
+            <w:rStyle w:val="Hyperlink"/>
+          </w:rPr>
+          <w:t xml:space="preserve">https://www.w3.org/TR/webarch/#identification</w:t>
+        </w:r>
+      </w:hyperlink>
+      <w:r>
+        <w:t xml:space="preserve">.</w:t>
+      </w:r>
+    </w:p>
+  </w:footnote>
+  <w:footnote w:id="53">
+    <w:p>
+      <w:pPr>
+        <w:pStyle w:val="FootnoteText"/>
+      </w:pPr>
+      <w:r>
+        <w:rPr>
+          <w:rStyle w:val="FootnoteReference"/>
+        </w:rPr>
+        <w:footnoteRef/>
+      </w:r>
+      <w:r>
+        <w:t xml:space="preserve"> </w:t>
+      </w:r>
+      <w:r>
+        <w:t xml:space="preserve">The term 'data' is used loosely here to cover everything from products to information to data.</w:t>
+      </w:r>
+    </w:p>
+  </w:footnote>
+  <w:footnote w:id="54">
+    <w:p>
+      <w:pPr>
+        <w:pStyle w:val="FootnoteText"/>
+      </w:pPr>
+      <w:r>
+        <w:rPr>
+          <w:rStyle w:val="FootnoteReference"/>
+        </w:rPr>
+        <w:footnoteRef/>
+      </w:r>
+      <w:r>
+        <w:t xml:space="preserve"> </w:t>
+      </w:r>
+      <w:r>
+        <w:t xml:space="preserve">The provision of data processing services in this way supports the WMO principles that no Member should be left behind and that no Member stands alone – through cooperation, all Members should have access to the necessary capability to work with the predicted increase in data volumes.</w:t>
+      </w:r>
+    </w:p>
+  </w:footnote>
+  <w:footnote w:id="56">
+    <w:p>
+      <w:pPr>
+        <w:pStyle w:val="FootnoteText"/>
+      </w:pPr>
+      <w:r>
+        <w:rPr>
+          <w:rStyle w:val="FootnoteReference"/>
+        </w:rPr>
+        <w:footnoteRef/>
+      </w:r>
+      <w:r>
+        <w:t xml:space="preserve"> </w:t>
+      </w:r>
+      <w:r>
+        <w:t xml:space="preserve">As an example of how Google uses schema.org structured markup to enable users to find datasets, see Castelvecchi, D. Google Unveils Search Engine for Open Data.</w:t>
+      </w:r>
+      <w:r>
+        <w:t xml:space="preserve"> </w:t>
+      </w:r>
+      <w:r>
+        <w:rPr>
+          <w:iCs/>
+          <w:i/>
+        </w:rPr>
+        <w:t xml:space="preserve">Nature</w:t>
+      </w:r>
+      <w:r>
+        <w:t xml:space="preserve"> </w:t>
+      </w:r>
+      <w:r>
+        <w:rPr>
+          <w:bCs/>
+          <w:b/>
+        </w:rPr>
+        <w:t xml:space="preserve">2018</w:t>
+      </w:r>
+      <w:r>
+        <w:t xml:space="preserve">,</w:t>
+      </w:r>
+      <w:r>
+        <w:t xml:space="preserve"> </w:t>
+      </w:r>
+      <w:r>
+        <w:rPr>
+          <w:iCs/>
+          <w:i/>
+        </w:rPr>
+        <w:t xml:space="preserve">561</w:t>
+      </w:r>
+      <w:r>
+        <w:t xml:space="preserve"> </w:t>
+      </w:r>
+      <w:r>
+        <w:t xml:space="preserve">(7722), 161–162.</w:t>
+      </w:r>
+      <w:r>
+        <w:t xml:space="preserve"> </w:t>
+      </w:r>
+      <w:hyperlink r:id="rId57">
+        <w:r>
+          <w:rPr>
+            <w:rStyle w:val="Hyperlink"/>
+          </w:rPr>
+          <w:t xml:space="preserve">https://doi.org/10.1038/d41586-018-06201-x</w:t>
+        </w:r>
+      </w:hyperlink>
+      <w:r>
+        <w:t xml:space="preserve">.</w:t>
+      </w:r>
     </w:p>
   </w:footnote>
 </w:footnotes>

</xml_diff>